<commit_message>
Add latest preprints to publications and CV
</commit_message>
<xml_diff>
--- a/CV/Yu_Sugihara_CV.docx
+++ b/CV/Yu_Sugihara_CV.docx
@@ -3448,6 +3448,231 @@
           <w:sz w:val="21"/>
         </w:rPr>
         <w:t>+ Authors contributed equally</w:t>
+      </w:r>
+    </w:p>
+    <w:p>
+      <w:pPr>
+        <w:numPr>
+          <w:ilvl w:val="0"/>
+          <w:numId w:val="29"/>
+        </w:numPr>
+        <w:tabs>
+          <w:tab w:val="num" w:pos="720"/>
+        </w:tabs>
+        <w:spacing w:after="140" w:line="247" w:lineRule="auto"/>
+        <w:jc w:val="left"/>
+        <w:rPr>
+          <w:rFonts w:eastAsia="Aptos" w:cs="Aptos"/>
+        </w:rPr>
+      </w:pPr>
+      <w:r>
+        <w:rPr>
+          <w:rFonts w:eastAsia="Aptos" w:cs="Aptos"/>
+          <w:color w:val="1F2937"/>
+          <w:sz w:val="23"/>
+          <w:szCs w:val="23"/>
+        </w:rPr>
+        <w:t>Posbeyikian A</w:t>
+      </w:r>
+      <w:r>
+        <w:rPr>
+          <w:rFonts w:eastAsia="Aptos" w:cs="Aptos"/>
+          <w:color w:val="1F2937"/>
+          <w:sz w:val="23"/>
+          <w:szCs w:val="23"/>
+          <w:vertAlign w:val="superscript"/>
+        </w:rPr>
+        <w:t>+</w:t>
+      </w:r>
+      <w:r>
+        <w:rPr>
+          <w:rFonts w:eastAsia="Aptos" w:cs="Aptos"/>
+          <w:color w:val="1F2937"/>
+          <w:sz w:val="23"/>
+          <w:szCs w:val="23"/>
+        </w:rPr>
+        <w:t>, Toghani A</w:t>
+      </w:r>
+      <w:r>
+        <w:rPr>
+          <w:rFonts w:eastAsia="Aptos" w:cs="Aptos"/>
+          <w:color w:val="1F2937"/>
+          <w:sz w:val="23"/>
+          <w:szCs w:val="23"/>
+          <w:vertAlign w:val="superscript"/>
+        </w:rPr>
+        <w:t>+</w:t>
+      </w:r>
+      <w:r>
+        <w:rPr>
+          <w:rFonts w:eastAsia="Aptos" w:cs="Aptos"/>
+          <w:color w:val="1F2937"/>
+          <w:sz w:val="23"/>
+          <w:szCs w:val="23"/>
+        </w:rPr>
+        <w:t>, McClelland AJ</w:t>
+      </w:r>
+      <w:r>
+        <w:rPr>
+          <w:rFonts w:eastAsia="Aptos" w:cs="Aptos"/>
+          <w:color w:val="1F2937"/>
+          <w:sz w:val="23"/>
+          <w:szCs w:val="23"/>
+          <w:vertAlign w:val="superscript"/>
+        </w:rPr>
+        <w:t>+</w:t>
+      </w:r>
+      <w:r>
+        <w:rPr>
+          <w:rFonts w:eastAsia="Aptos" w:cs="Aptos"/>
+          <w:color w:val="1F2937"/>
+          <w:sz w:val="23"/>
+          <w:szCs w:val="23"/>
+        </w:rPr>
+        <w:t xml:space="preserve">, Kamoun S*, </w:t>
+      </w:r>
+      <w:r>
+        <w:rPr>
+          <w:rFonts w:eastAsia="Aptos" w:cs="Aptos"/>
+          <w:color w:val="1F2937"/>
+          <w:sz w:val="23"/>
+          <w:szCs w:val="23"/>
+          <w:b/>
+          <w:u w:val="single"/>
+        </w:rPr>
+        <w:t>Sugihara Y</w:t>
+      </w:r>
+      <w:r>
+        <w:rPr>
+          <w:rFonts w:eastAsia="Aptos" w:cs="Aptos"/>
+          <w:color w:val="1F2937"/>
+          <w:sz w:val="23"/>
+          <w:szCs w:val="23"/>
+        </w:rPr>
+        <w:t xml:space="preserve">*, Contreras MP* (2026) </w:t>
+      </w:r>
+      <w:hyperlink r:id="rId30" w:tgtFrame="_blank" w:history="1">
+        <w:r>
+          <w:rPr>
+            <w:rStyle w:val="Hyperlink"/>
+            <w:rFonts w:eastAsia="Aptos" w:cs="Aptos"/>
+            <w:szCs w:val="23"/>
+          </w:rPr>
+          <w:t>Fold on Tight: Ten Things to Know About AI Structure Prediction in Plant Immunity</w:t>
+        </w:r>
+      </w:hyperlink>
+      <w:r>
+        <w:rPr>
+          <w:rFonts w:eastAsia="Aptos" w:cs="Aptos"/>
+          <w:color w:val="1F2937"/>
+          <w:sz w:val="23"/>
+          <w:szCs w:val="23"/>
+        </w:rPr>
+        <w:t xml:space="preserve">. </w:t>
+      </w:r>
+      <w:r>
+        <w:rPr>
+          <w:rFonts w:eastAsia="Aptos" w:cs="Aptos"/>
+          <w:color w:val="1F2937"/>
+          <w:sz w:val="23"/>
+          <w:szCs w:val="23"/>
+          <w:i/>
+          <w:iCs/>
+        </w:rPr>
+        <w:t>Zenodo</w:t>
+      </w:r>
+      <w:r>
+        <w:rPr>
+          <w:rFonts w:eastAsia="Aptos" w:cs="Aptos"/>
+          <w:color w:val="1F2937"/>
+          <w:sz w:val="23"/>
+          <w:szCs w:val="23"/>
+        </w:rPr>
+        <w:t>. DOI:10.5281/zenodo.22100279</w:t>
+      </w:r>
+    </w:p>
+    <w:p>
+      <w:pPr>
+        <w:numPr>
+          <w:ilvl w:val="0"/>
+          <w:numId w:val="29"/>
+        </w:numPr>
+        <w:tabs>
+          <w:tab w:val="num" w:pos="720"/>
+        </w:tabs>
+        <w:spacing w:after="140" w:line="247" w:lineRule="auto"/>
+        <w:jc w:val="left"/>
+        <w:rPr>
+          <w:rFonts w:eastAsia="Aptos" w:cs="Aptos"/>
+        </w:rPr>
+      </w:pPr>
+      <w:r>
+        <w:rPr>
+          <w:rFonts w:eastAsia="Aptos" w:cs="Aptos"/>
+          <w:color w:val="1F2937"/>
+          <w:sz w:val="23"/>
+          <w:szCs w:val="23"/>
+        </w:rPr>
+        <w:t xml:space="preserve">Bennett JW, </w:t>
+      </w:r>
+      <w:r>
+        <w:rPr>
+          <w:rFonts w:eastAsia="Aptos" w:cs="Aptos"/>
+          <w:color w:val="1F2937"/>
+          <w:sz w:val="23"/>
+          <w:szCs w:val="23"/>
+          <w:b/>
+          <w:u w:val="single"/>
+        </w:rPr>
+        <w:t>Sugihara Y</w:t>
+      </w:r>
+      <w:r>
+        <w:rPr>
+          <w:rFonts w:eastAsia="Aptos" w:cs="Aptos"/>
+          <w:color w:val="1F2937"/>
+          <w:sz w:val="23"/>
+          <w:szCs w:val="23"/>
+        </w:rPr>
+        <w:t xml:space="preserve">, Haidoulis JF, Rodney CA, Zdrzałek R, Zanchet E, Saado I, Paajanen P, Nicholson P, Asuke S, Banfield MJ* (2026) </w:t>
+      </w:r>
+      <w:hyperlink r:id="rId31" w:tgtFrame="_blank" w:history="1">
+        <w:r>
+          <w:rPr>
+            <w:rStyle w:val="Hyperlink"/>
+            <w:rFonts w:eastAsia="Aptos" w:cs="Aptos"/>
+            <w:szCs w:val="23"/>
+          </w:rPr>
+          <w:t>A wheat immune receptor pair executes cell death through a helper MLKL</w:t>
+        </w:r>
+      </w:hyperlink>
+      <w:r>
+        <w:rPr>
+          <w:rFonts w:eastAsia="Aptos" w:cs="Aptos"/>
+          <w:color w:val="1F2937"/>
+          <w:sz w:val="23"/>
+          <w:szCs w:val="23"/>
+        </w:rPr>
+        <w:t xml:space="preserve">. </w:t>
+      </w:r>
+      <w:r>
+        <w:rPr>
+          <w:rFonts w:eastAsia="Aptos" w:cs="Aptos"/>
+          <w:color w:val="1F2937"/>
+          <w:sz w:val="23"/>
+          <w:szCs w:val="23"/>
+          <w:i/>
+          <w:iCs/>
+        </w:rPr>
+        <w:t>bioRxiv</w:t>
+      </w:r>
+      <w:r>
+        <w:rPr>
+          <w:rFonts w:eastAsia="Aptos" w:cs="Aptos"/>
+          <w:color w:val="1F2937"/>
+          <w:sz w:val="23"/>
+          <w:szCs w:val="23"/>
+        </w:rPr>
+        <w:t>. DOI:10.64898/2026.08.07.743466</w:t>
       </w:r>
     </w:p>
     <w:p>

</xml_diff>